<commit_message>
Update detailed research report
</commit_message>
<xml_diff>
--- a/reports/IEEE_Skin_Lesion_Classification_Report_Detailed.docx
+++ b/reports/IEEE_Skin_Lesion_Classification_Report_Detailed.docx
@@ -175,7 +175,7 @@
             <w:r>
               <w:rPr>
                 <w:rFonts w:ascii="Times New Roman" w:hAnsi="Times New Roman"/>
-                <w:sz w:val="14"/>
+                <w:sz w:val="16"/>
               </w:rPr>
               <w:t>Input</w:t>
             </w:r>
@@ -193,7 +193,7 @@
             <w:r>
               <w:rPr>
                 <w:rFonts w:ascii="Times New Roman" w:hAnsi="Times New Roman"/>
-                <w:sz w:val="14"/>
+                <w:sz w:val="16"/>
               </w:rPr>
               <w:t>Preprocess</w:t>
             </w:r>
@@ -211,7 +211,7 @@
             <w:r>
               <w:rPr>
                 <w:rFonts w:ascii="Times New Roman" w:hAnsi="Times New Roman"/>
-                <w:sz w:val="14"/>
+                <w:sz w:val="16"/>
               </w:rPr>
               <w:t>Frozen encoder</w:t>
             </w:r>
@@ -229,7 +229,7 @@
             <w:r>
               <w:rPr>
                 <w:rFonts w:ascii="Times New Roman" w:hAnsi="Times New Roman"/>
-                <w:sz w:val="14"/>
+                <w:sz w:val="16"/>
               </w:rPr>
               <w:t>Embedding</w:t>
             </w:r>
@@ -247,7 +247,7 @@
             <w:r>
               <w:rPr>
                 <w:rFonts w:ascii="Times New Roman" w:hAnsi="Times New Roman"/>
-                <w:sz w:val="14"/>
+                <w:sz w:val="16"/>
               </w:rPr>
               <w:t>Classifier</w:t>
             </w:r>
@@ -265,7 +265,7 @@
             <w:r>
               <w:rPr>
                 <w:rFonts w:ascii="Times New Roman" w:hAnsi="Times New Roman"/>
-                <w:sz w:val="14"/>
+                <w:sz w:val="16"/>
               </w:rPr>
               <w:t>Output</w:t>
             </w:r>
@@ -287,7 +287,7 @@
             <w:r>
               <w:rPr>
                 <w:rFonts w:ascii="Times New Roman" w:hAnsi="Times New Roman"/>
-                <w:sz w:val="14"/>
+                <w:sz w:val="16"/>
               </w:rPr>
               <w:t>Image</w:t>
             </w:r>
@@ -304,7 +304,7 @@
             <w:r>
               <w:rPr>
                 <w:rFonts w:ascii="Times New Roman" w:hAnsi="Times New Roman"/>
-                <w:sz w:val="14"/>
+                <w:sz w:val="16"/>
               </w:rPr>
               <w:t>Resize/crop</w:t>
               <w:br/>
@@ -323,7 +323,7 @@
             <w:r>
               <w:rPr>
                 <w:rFonts w:ascii="Times New Roman" w:hAnsi="Times New Roman"/>
-                <w:sz w:val="14"/>
+                <w:sz w:val="16"/>
               </w:rPr>
               <w:t>EfficientNet or</w:t>
               <w:br/>
@@ -342,7 +342,7 @@
             <w:r>
               <w:rPr>
                 <w:rFonts w:ascii="Times New Roman" w:hAnsi="Times New Roman"/>
-                <w:sz w:val="14"/>
+                <w:sz w:val="16"/>
               </w:rPr>
               <w:t>1280 / 768 /</w:t>
               <w:br/>
@@ -361,7 +361,7 @@
             <w:r>
               <w:rPr>
                 <w:rFonts w:ascii="Times New Roman" w:hAnsi="Times New Roman"/>
-                <w:sz w:val="14"/>
+                <w:sz w:val="16"/>
               </w:rPr>
               <w:t>Linear / MLP /</w:t>
               <w:br/>
@@ -380,7 +380,7 @@
             <w:r>
               <w:rPr>
                 <w:rFonts w:ascii="Times New Roman" w:hAnsi="Times New Roman"/>
-                <w:sz w:val="14"/>
+                <w:sz w:val="16"/>
               </w:rPr>
               <w:t>Seven scores</w:t>
               <w:br/>
@@ -644,7 +644,7 @@
             <w:r>
               <w:rPr>
                 <w:rFonts w:ascii="Times New Roman" w:hAnsi="Times New Roman"/>
-                <w:sz w:val="14"/>
+                <w:sz w:val="16"/>
               </w:rPr>
               <w:t>Head</w:t>
             </w:r>
@@ -662,7 +662,7 @@
             <w:r>
               <w:rPr>
                 <w:rFonts w:ascii="Times New Roman" w:hAnsi="Times New Roman"/>
-                <w:sz w:val="14"/>
+                <w:sz w:val="16"/>
               </w:rPr>
               <w:t>Val. F1</w:t>
             </w:r>
@@ -680,7 +680,7 @@
             <w:r>
               <w:rPr>
                 <w:rFonts w:ascii="Times New Roman" w:hAnsi="Times New Roman"/>
-                <w:sz w:val="14"/>
+                <w:sz w:val="16"/>
               </w:rPr>
               <w:t>Internal F1</w:t>
             </w:r>
@@ -698,7 +698,7 @@
             <w:r>
               <w:rPr>
                 <w:rFonts w:ascii="Times New Roman" w:hAnsi="Times New Roman"/>
-                <w:sz w:val="14"/>
+                <w:sz w:val="16"/>
               </w:rPr>
               <w:t>Official F1</w:t>
             </w:r>
@@ -716,7 +716,7 @@
             <w:r>
               <w:rPr>
                 <w:rFonts w:ascii="Times New Roman" w:hAnsi="Times New Roman"/>
-                <w:sz w:val="14"/>
+                <w:sz w:val="16"/>
               </w:rPr>
               <w:t>Official F0.5</w:t>
             </w:r>
@@ -739,7 +739,7 @@
             <w:r>
               <w:rPr>
                 <w:rFonts w:ascii="Times New Roman" w:hAnsi="Times New Roman"/>
-                <w:sz w:val="14"/>
+                <w:sz w:val="16"/>
               </w:rPr>
               <w:t>Linear</w:t>
             </w:r>
@@ -757,7 +757,7 @@
             <w:r>
               <w:rPr>
                 <w:rFonts w:ascii="Times New Roman" w:hAnsi="Times New Roman"/>
-                <w:sz w:val="14"/>
+                <w:sz w:val="16"/>
               </w:rPr>
               <w:t>0.6105</w:t>
             </w:r>
@@ -775,7 +775,7 @@
             <w:r>
               <w:rPr>
                 <w:rFonts w:ascii="Times New Roman" w:hAnsi="Times New Roman"/>
-                <w:sz w:val="14"/>
+                <w:sz w:val="16"/>
               </w:rPr>
               <w:t>0.5976</w:t>
             </w:r>
@@ -793,7 +793,7 @@
             <w:r>
               <w:rPr>
                 <w:rFonts w:ascii="Times New Roman" w:hAnsi="Times New Roman"/>
-                <w:sz w:val="14"/>
+                <w:sz w:val="16"/>
               </w:rPr>
               <w:t>0.6146</w:t>
             </w:r>
@@ -811,7 +811,7 @@
             <w:r>
               <w:rPr>
                 <w:rFonts w:ascii="Times New Roman" w:hAnsi="Times New Roman"/>
-                <w:sz w:val="14"/>
+                <w:sz w:val="16"/>
               </w:rPr>
               <w:t>0.6150</w:t>
             </w:r>
@@ -834,7 +834,7 @@
             <w:r>
               <w:rPr>
                 <w:rFonts w:ascii="Times New Roman" w:hAnsi="Times New Roman"/>
-                <w:sz w:val="14"/>
+                <w:sz w:val="16"/>
               </w:rPr>
               <w:t>MLP</w:t>
             </w:r>
@@ -852,7 +852,7 @@
             <w:r>
               <w:rPr>
                 <w:rFonts w:ascii="Times New Roman" w:hAnsi="Times New Roman"/>
-                <w:sz w:val="14"/>
+                <w:sz w:val="16"/>
               </w:rPr>
               <w:t>0.6078</w:t>
             </w:r>
@@ -870,7 +870,7 @@
             <w:r>
               <w:rPr>
                 <w:rFonts w:ascii="Times New Roman" w:hAnsi="Times New Roman"/>
-                <w:sz w:val="14"/>
+                <w:sz w:val="16"/>
               </w:rPr>
               <w:t>0.6083</w:t>
             </w:r>
@@ -888,7 +888,7 @@
             <w:r>
               <w:rPr>
                 <w:rFonts w:ascii="Times New Roman" w:hAnsi="Times New Roman"/>
-                <w:sz w:val="14"/>
+                <w:sz w:val="16"/>
               </w:rPr>
               <w:t>0.6068</w:t>
             </w:r>
@@ -906,7 +906,7 @@
             <w:r>
               <w:rPr>
                 <w:rFonts w:ascii="Times New Roman" w:hAnsi="Times New Roman"/>
-                <w:sz w:val="14"/>
+                <w:sz w:val="16"/>
               </w:rPr>
               <w:t>0.6105</w:t>
             </w:r>
@@ -928,7 +928,7 @@
             <w:r>
               <w:rPr>
                 <w:rFonts w:ascii="Times New Roman" w:hAnsi="Times New Roman"/>
-                <w:sz w:val="14"/>
+                <w:sz w:val="16"/>
               </w:rPr>
               <w:t>XGBoost</w:t>
             </w:r>
@@ -945,7 +945,7 @@
             <w:r>
               <w:rPr>
                 <w:rFonts w:ascii="Times New Roman" w:hAnsi="Times New Roman"/>
-                <w:sz w:val="14"/>
+                <w:sz w:val="16"/>
               </w:rPr>
               <w:t>0.5655</w:t>
             </w:r>
@@ -962,7 +962,7 @@
             <w:r>
               <w:rPr>
                 <w:rFonts w:ascii="Times New Roman" w:hAnsi="Times New Roman"/>
-                <w:sz w:val="14"/>
+                <w:sz w:val="16"/>
               </w:rPr>
               <w:t>0.6020</w:t>
             </w:r>
@@ -979,7 +979,7 @@
             <w:r>
               <w:rPr>
                 <w:rFonts w:ascii="Times New Roman" w:hAnsi="Times New Roman"/>
-                <w:sz w:val="14"/>
+                <w:sz w:val="16"/>
               </w:rPr>
               <w:t>0.5866</w:t>
             </w:r>
@@ -996,7 +996,7 @@
             <w:r>
               <w:rPr>
                 <w:rFonts w:ascii="Times New Roman" w:hAnsi="Times New Roman"/>
-                <w:sz w:val="14"/>
+                <w:sz w:val="16"/>
               </w:rPr>
               <w:t>0.6171</w:t>
             </w:r>
@@ -1066,7 +1066,7 @@
             <w:r>
               <w:rPr>
                 <w:rFonts w:ascii="Times New Roman" w:hAnsi="Times New Roman"/>
-                <w:sz w:val="14"/>
+                <w:sz w:val="16"/>
               </w:rPr>
               <w:t>Encoder/head</w:t>
             </w:r>
@@ -1084,7 +1084,7 @@
             <w:r>
               <w:rPr>
                 <w:rFonts w:ascii="Times New Roman" w:hAnsi="Times New Roman"/>
-                <w:sz w:val="14"/>
+                <w:sz w:val="16"/>
               </w:rPr>
               <w:t>Selection</w:t>
             </w:r>
@@ -1102,7 +1102,7 @@
             <w:r>
               <w:rPr>
                 <w:rFonts w:ascii="Times New Roman" w:hAnsi="Times New Roman"/>
-                <w:sz w:val="14"/>
+                <w:sz w:val="16"/>
               </w:rPr>
               <w:t>Accuracy</w:t>
             </w:r>
@@ -1120,7 +1120,7 @@
             <w:r>
               <w:rPr>
                 <w:rFonts w:ascii="Times New Roman" w:hAnsi="Times New Roman"/>
-                <w:sz w:val="14"/>
+                <w:sz w:val="16"/>
               </w:rPr>
               <w:t>Macro-F1</w:t>
             </w:r>
@@ -1138,7 +1138,7 @@
             <w:r>
               <w:rPr>
                 <w:rFonts w:ascii="Times New Roman" w:hAnsi="Times New Roman"/>
-                <w:sz w:val="14"/>
+                <w:sz w:val="16"/>
               </w:rPr>
               <w:t>Macro-F0.5</w:t>
             </w:r>
@@ -1161,7 +1161,7 @@
             <w:r>
               <w:rPr>
                 <w:rFonts w:ascii="Times New Roman" w:hAnsi="Times New Roman"/>
-                <w:sz w:val="14"/>
+                <w:sz w:val="16"/>
               </w:rPr>
               <w:t>Base + MLP</w:t>
             </w:r>
@@ -1179,7 +1179,7 @@
             <w:r>
               <w:rPr>
                 <w:rFonts w:ascii="Times New Roman" w:hAnsi="Times New Roman"/>
-                <w:sz w:val="14"/>
+                <w:sz w:val="16"/>
               </w:rPr>
               <w:t>Validation</w:t>
             </w:r>
@@ -1197,7 +1197,7 @@
             <w:r>
               <w:rPr>
                 <w:rFonts w:ascii="Times New Roman" w:hAnsi="Times New Roman"/>
-                <w:sz w:val="14"/>
+                <w:sz w:val="16"/>
               </w:rPr>
               <w:t>0.8056</w:t>
             </w:r>
@@ -1215,7 +1215,7 @@
             <w:r>
               <w:rPr>
                 <w:rFonts w:ascii="Times New Roman" w:hAnsi="Times New Roman"/>
-                <w:sz w:val="14"/>
+                <w:sz w:val="16"/>
               </w:rPr>
               <w:t>0.7030</w:t>
             </w:r>
@@ -1233,7 +1233,7 @@
             <w:r>
               <w:rPr>
                 <w:rFonts w:ascii="Times New Roman" w:hAnsi="Times New Roman"/>
-                <w:sz w:val="14"/>
+                <w:sz w:val="16"/>
               </w:rPr>
               <w:t>0.7055</w:t>
             </w:r>
@@ -1256,7 +1256,7 @@
             <w:r>
               <w:rPr>
                 <w:rFonts w:ascii="Times New Roman" w:hAnsi="Times New Roman"/>
-                <w:sz w:val="14"/>
+                <w:sz w:val="16"/>
               </w:rPr>
               <w:t>Base + linear</w:t>
             </w:r>
@@ -1274,7 +1274,7 @@
             <w:r>
               <w:rPr>
                 <w:rFonts w:ascii="Times New Roman" w:hAnsi="Times New Roman"/>
-                <w:sz w:val="14"/>
+                <w:sz w:val="16"/>
               </w:rPr>
               <w:t>Validation</w:t>
             </w:r>
@@ -1292,7 +1292,7 @@
             <w:r>
               <w:rPr>
                 <w:rFonts w:ascii="Times New Roman" w:hAnsi="Times New Roman"/>
-                <w:sz w:val="14"/>
+                <w:sz w:val="16"/>
               </w:rPr>
               <w:t>0.7917</w:t>
             </w:r>
@@ -1310,7 +1310,7 @@
             <w:r>
               <w:rPr>
                 <w:rFonts w:ascii="Times New Roman" w:hAnsi="Times New Roman"/>
-                <w:sz w:val="14"/>
+                <w:sz w:val="16"/>
               </w:rPr>
               <w:t>0.6773</w:t>
             </w:r>
@@ -1328,7 +1328,7 @@
             <w:r>
               <w:rPr>
                 <w:rFonts w:ascii="Times New Roman" w:hAnsi="Times New Roman"/>
-                <w:sz w:val="14"/>
+                <w:sz w:val="16"/>
               </w:rPr>
               <w:t>0.6865</w:t>
             </w:r>
@@ -1351,7 +1351,7 @@
             <w:r>
               <w:rPr>
                 <w:rFonts w:ascii="Times New Roman" w:hAnsi="Times New Roman"/>
-                <w:sz w:val="14"/>
+                <w:sz w:val="16"/>
               </w:rPr>
               <w:t>Base + XGBoost</w:t>
             </w:r>
@@ -1369,7 +1369,7 @@
             <w:r>
               <w:rPr>
                 <w:rFonts w:ascii="Times New Roman" w:hAnsi="Times New Roman"/>
-                <w:sz w:val="14"/>
+                <w:sz w:val="16"/>
               </w:rPr>
               <w:t>Validation</w:t>
             </w:r>
@@ -1387,7 +1387,7 @@
             <w:r>
               <w:rPr>
                 <w:rFonts w:ascii="Times New Roman" w:hAnsi="Times New Roman"/>
-                <w:sz w:val="14"/>
+                <w:sz w:val="16"/>
               </w:rPr>
               <w:t>0.7566</w:t>
             </w:r>
@@ -1405,7 +1405,7 @@
             <w:r>
               <w:rPr>
                 <w:rFonts w:ascii="Times New Roman" w:hAnsi="Times New Roman"/>
-                <w:sz w:val="14"/>
+                <w:sz w:val="16"/>
               </w:rPr>
               <w:t>0.6408</w:t>
             </w:r>
@@ -1423,7 +1423,7 @@
             <w:r>
               <w:rPr>
                 <w:rFonts w:ascii="Times New Roman" w:hAnsi="Times New Roman"/>
-                <w:sz w:val="14"/>
+                <w:sz w:val="16"/>
               </w:rPr>
               <w:t>0.6558</w:t>
             </w:r>
@@ -1446,7 +1446,7 @@
             <w:r>
               <w:rPr>
                 <w:rFonts w:ascii="Times New Roman" w:hAnsi="Times New Roman"/>
-                <w:sz w:val="14"/>
+                <w:sz w:val="16"/>
               </w:rPr>
               <w:t>Large + author probe</w:t>
             </w:r>
@@ -1464,7 +1464,7 @@
             <w:r>
               <w:rPr>
                 <w:rFonts w:ascii="Times New Roman" w:hAnsi="Times New Roman"/>
-                <w:sz w:val="14"/>
+                <w:sz w:val="16"/>
               </w:rPr>
               <w:t>Fixed recipe</w:t>
             </w:r>
@@ -1482,7 +1482,7 @@
             <w:r>
               <w:rPr>
                 <w:rFonts w:ascii="Times New Roman" w:hAnsi="Times New Roman"/>
-                <w:sz w:val="14"/>
+                <w:sz w:val="16"/>
               </w:rPr>
               <w:t>0.8294</w:t>
             </w:r>
@@ -1500,7 +1500,7 @@
             <w:r>
               <w:rPr>
                 <w:rFonts w:ascii="Times New Roman" w:hAnsi="Times New Roman"/>
-                <w:sz w:val="14"/>
+                <w:sz w:val="16"/>
               </w:rPr>
               <w:t>0.7158</w:t>
             </w:r>
@@ -1518,7 +1518,7 @@
             <w:r>
               <w:rPr>
                 <w:rFonts w:ascii="Times New Roman" w:hAnsi="Times New Roman"/>
-                <w:sz w:val="14"/>
+                <w:sz w:val="16"/>
               </w:rPr>
               <w:t>0.7415</w:t>
             </w:r>
@@ -1541,7 +1541,7 @@
             <w:r>
               <w:rPr>
                 <w:rFonts w:ascii="Times New Roman" w:hAnsi="Times New Roman"/>
-                <w:sz w:val="14"/>
+                <w:sz w:val="16"/>
               </w:rPr>
               <w:t>Large + custom linear</w:t>
             </w:r>
@@ -1559,7 +1559,7 @@
             <w:r>
               <w:rPr>
                 <w:rFonts w:ascii="Times New Roman" w:hAnsi="Times New Roman"/>
-                <w:sz w:val="14"/>
+                <w:sz w:val="16"/>
               </w:rPr>
               <w:t>Validation</w:t>
             </w:r>
@@ -1577,7 +1577,7 @@
             <w:r>
               <w:rPr>
                 <w:rFonts w:ascii="Times New Roman" w:hAnsi="Times New Roman"/>
-                <w:sz w:val="14"/>
+                <w:sz w:val="16"/>
               </w:rPr>
               <w:t>0.8313</w:t>
             </w:r>
@@ -1595,7 +1595,7 @@
             <w:r>
               <w:rPr>
                 <w:rFonts w:ascii="Times New Roman" w:hAnsi="Times New Roman"/>
-                <w:sz w:val="14"/>
+                <w:sz w:val="16"/>
               </w:rPr>
               <w:t>0.7380</w:t>
             </w:r>
@@ -1613,7 +1613,7 @@
             <w:r>
               <w:rPr>
                 <w:rFonts w:ascii="Times New Roman" w:hAnsi="Times New Roman"/>
-                <w:sz w:val="14"/>
+                <w:sz w:val="16"/>
               </w:rPr>
               <w:t>0.7463</w:t>
             </w:r>
@@ -1636,7 +1636,7 @@
             <w:r>
               <w:rPr>
                 <w:rFonts w:ascii="Times New Roman" w:hAnsi="Times New Roman"/>
-                <w:sz w:val="14"/>
+                <w:sz w:val="16"/>
               </w:rPr>
               <w:t>Large + MLP (192-64)</w:t>
             </w:r>
@@ -1654,7 +1654,7 @@
             <w:r>
               <w:rPr>
                 <w:rFonts w:ascii="Times New Roman" w:hAnsi="Times New Roman"/>
-                <w:sz w:val="14"/>
+                <w:sz w:val="16"/>
               </w:rPr>
               <w:t>Train CV</w:t>
             </w:r>
@@ -1672,7 +1672,7 @@
             <w:r>
               <w:rPr>
                 <w:rFonts w:ascii="Times New Roman" w:hAnsi="Times New Roman"/>
-                <w:sz w:val="14"/>
+                <w:sz w:val="16"/>
               </w:rPr>
               <w:t>0.8214</w:t>
             </w:r>
@@ -1690,7 +1690,7 @@
             <w:r>
               <w:rPr>
                 <w:rFonts w:ascii="Times New Roman" w:hAnsi="Times New Roman"/>
-                <w:sz w:val="14"/>
+                <w:sz w:val="16"/>
               </w:rPr>
               <w:t>0.7096</w:t>
             </w:r>
@@ -1708,7 +1708,7 @@
             <w:r>
               <w:rPr>
                 <w:rFonts w:ascii="Times New Roman" w:hAnsi="Times New Roman"/>
-                <w:sz w:val="14"/>
+                <w:sz w:val="16"/>
               </w:rPr>
               <w:t>0.7202</w:t>
             </w:r>
@@ -1730,7 +1730,7 @@
             <w:r>
               <w:rPr>
                 <w:rFonts w:ascii="Times New Roman" w:hAnsi="Times New Roman"/>
-                <w:sz w:val="14"/>
+                <w:sz w:val="16"/>
               </w:rPr>
               <w:t>Large + XGBoost+LDA</w:t>
             </w:r>
@@ -1747,7 +1747,7 @@
             <w:r>
               <w:rPr>
                 <w:rFonts w:ascii="Times New Roman" w:hAnsi="Times New Roman"/>
-                <w:sz w:val="14"/>
+                <w:sz w:val="16"/>
               </w:rPr>
               <w:t>Train CV</w:t>
             </w:r>
@@ -1764,7 +1764,7 @@
             <w:r>
               <w:rPr>
                 <w:rFonts w:ascii="Times New Roman" w:hAnsi="Times New Roman"/>
-                <w:sz w:val="14"/>
+                <w:sz w:val="16"/>
               </w:rPr>
               <w:t>0.8201</w:t>
             </w:r>
@@ -1781,7 +1781,7 @@
             <w:r>
               <w:rPr>
                 <w:rFonts w:ascii="Times New Roman" w:hAnsi="Times New Roman"/>
-                <w:sz w:val="14"/>
+                <w:sz w:val="16"/>
               </w:rPr>
               <w:t>0.7267</w:t>
             </w:r>
@@ -1798,7 +1798,7 @@
             <w:r>
               <w:rPr>
                 <w:rFonts w:ascii="Times New Roman" w:hAnsi="Times New Roman"/>
-                <w:sz w:val="14"/>
+                <w:sz w:val="16"/>
               </w:rPr>
               <w:t>0.7235</w:t>
             </w:r>
@@ -1852,7 +1852,7 @@
             <w:r>
               <w:rPr>
                 <w:rFonts w:ascii="Times New Roman" w:hAnsi="Times New Roman"/>
-                <w:sz w:val="14"/>
+                <w:sz w:val="16"/>
               </w:rPr>
               <w:t>Head</w:t>
             </w:r>
@@ -1870,7 +1870,7 @@
             <w:r>
               <w:rPr>
                 <w:rFonts w:ascii="Times New Roman" w:hAnsi="Times New Roman"/>
-                <w:sz w:val="14"/>
+                <w:sz w:val="16"/>
               </w:rPr>
               <w:t>Accuracy</w:t>
             </w:r>
@@ -1888,7 +1888,7 @@
             <w:r>
               <w:rPr>
                 <w:rFonts w:ascii="Times New Roman" w:hAnsi="Times New Roman"/>
-                <w:sz w:val="14"/>
+                <w:sz w:val="16"/>
               </w:rPr>
               <w:t>Macro F1</w:t>
             </w:r>
@@ -1906,7 +1906,7 @@
             <w:r>
               <w:rPr>
                 <w:rFonts w:ascii="Times New Roman" w:hAnsi="Times New Roman"/>
-                <w:sz w:val="14"/>
+                <w:sz w:val="16"/>
               </w:rPr>
               <w:t>Macro F0.5</w:t>
             </w:r>
@@ -1924,7 +1924,7 @@
             <w:r>
               <w:rPr>
                 <w:rFonts w:ascii="Times New Roman" w:hAnsi="Times New Roman"/>
-                <w:sz w:val="14"/>
+                <w:sz w:val="16"/>
               </w:rPr>
               <w:t>Weighted F1</w:t>
             </w:r>
@@ -1947,7 +1947,7 @@
             <w:r>
               <w:rPr>
                 <w:rFonts w:ascii="Times New Roman" w:hAnsi="Times New Roman"/>
-                <w:sz w:val="14"/>
+                <w:sz w:val="16"/>
               </w:rPr>
               <w:t>Author probe</w:t>
             </w:r>
@@ -1965,7 +1965,7 @@
             <w:r>
               <w:rPr>
                 <w:rFonts w:ascii="Times New Roman" w:hAnsi="Times New Roman"/>
-                <w:sz w:val="14"/>
+                <w:sz w:val="16"/>
               </w:rPr>
               <w:t>92.37</w:t>
             </w:r>
@@ -1983,7 +1983,7 @@
             <w:r>
               <w:rPr>
                 <w:rFonts w:ascii="Times New Roman" w:hAnsi="Times New Roman"/>
-                <w:sz w:val="14"/>
+                <w:sz w:val="16"/>
               </w:rPr>
               <w:t>80.98</w:t>
             </w:r>
@@ -2001,7 +2001,7 @@
             <w:r>
               <w:rPr>
                 <w:rFonts w:ascii="Times New Roman" w:hAnsi="Times New Roman"/>
-                <w:sz w:val="14"/>
+                <w:sz w:val="16"/>
               </w:rPr>
               <w:t>82.09</w:t>
             </w:r>
@@ -2019,7 +2019,7 @@
             <w:r>
               <w:rPr>
                 <w:rFonts w:ascii="Times New Roman" w:hAnsi="Times New Roman"/>
-                <w:sz w:val="14"/>
+                <w:sz w:val="16"/>
               </w:rPr>
               <w:t>92.22</w:t>
             </w:r>
@@ -2042,7 +2042,7 @@
             <w:r>
               <w:rPr>
                 <w:rFonts w:ascii="Times New Roman" w:hAnsi="Times New Roman"/>
-                <w:sz w:val="14"/>
+                <w:sz w:val="16"/>
               </w:rPr>
               <w:t>Custom linear</w:t>
             </w:r>
@@ -2060,7 +2060,7 @@
             <w:r>
               <w:rPr>
                 <w:rFonts w:ascii="Times New Roman" w:hAnsi="Times New Roman"/>
-                <w:sz w:val="14"/>
+                <w:sz w:val="16"/>
               </w:rPr>
               <w:t>91.64</w:t>
             </w:r>
@@ -2078,7 +2078,7 @@
             <w:r>
               <w:rPr>
                 <w:rFonts w:ascii="Times New Roman" w:hAnsi="Times New Roman"/>
-                <w:sz w:val="14"/>
+                <w:sz w:val="16"/>
               </w:rPr>
               <w:t>79.36</w:t>
             </w:r>
@@ -2096,7 +2096,7 @@
             <w:r>
               <w:rPr>
                 <w:rFonts w:ascii="Times New Roman" w:hAnsi="Times New Roman"/>
-                <w:sz w:val="14"/>
+                <w:sz w:val="16"/>
               </w:rPr>
               <w:t>77.62</w:t>
             </w:r>
@@ -2114,7 +2114,7 @@
             <w:r>
               <w:rPr>
                 <w:rFonts w:ascii="Times New Roman" w:hAnsi="Times New Roman"/>
-                <w:sz w:val="14"/>
+                <w:sz w:val="16"/>
               </w:rPr>
               <w:t>91.79</w:t>
             </w:r>
@@ -2137,7 +2137,7 @@
             <w:r>
               <w:rPr>
                 <w:rFonts w:ascii="Times New Roman" w:hAnsi="Times New Roman"/>
-                <w:sz w:val="14"/>
+                <w:sz w:val="16"/>
               </w:rPr>
               <w:t>MLP 192–64</w:t>
             </w:r>
@@ -2155,7 +2155,7 @@
             <w:r>
               <w:rPr>
                 <w:rFonts w:ascii="Times New Roman" w:hAnsi="Times New Roman"/>
-                <w:sz w:val="14"/>
+                <w:sz w:val="16"/>
               </w:rPr>
               <w:t>92.13</w:t>
             </w:r>
@@ -2173,7 +2173,7 @@
             <w:r>
               <w:rPr>
                 <w:rFonts w:ascii="Times New Roman" w:hAnsi="Times New Roman"/>
-                <w:sz w:val="14"/>
+                <w:sz w:val="16"/>
               </w:rPr>
               <w:t>81.73</w:t>
             </w:r>
@@ -2191,7 +2191,7 @@
             <w:r>
               <w:rPr>
                 <w:rFonts w:ascii="Times New Roman" w:hAnsi="Times New Roman"/>
-                <w:sz w:val="14"/>
+                <w:sz w:val="16"/>
               </w:rPr>
               <w:t>80.75</w:t>
             </w:r>
@@ -2209,7 +2209,7 @@
             <w:r>
               <w:rPr>
                 <w:rFonts w:ascii="Times New Roman" w:hAnsi="Times New Roman"/>
-                <w:sz w:val="14"/>
+                <w:sz w:val="16"/>
               </w:rPr>
               <w:t>92.27</w:t>
             </w:r>
@@ -2232,7 +2232,7 @@
             <w:r>
               <w:rPr>
                 <w:rFonts w:ascii="Times New Roman" w:hAnsi="Times New Roman"/>
-                <w:sz w:val="14"/>
+                <w:sz w:val="16"/>
               </w:rPr>
               <w:t>MLP 256–64</w:t>
             </w:r>
@@ -2250,7 +2250,7 @@
             <w:r>
               <w:rPr>
                 <w:rFonts w:ascii="Times New Roman" w:hAnsi="Times New Roman"/>
-                <w:sz w:val="14"/>
+                <w:sz w:val="16"/>
               </w:rPr>
               <w:t>92.45</w:t>
             </w:r>
@@ -2268,7 +2268,7 @@
             <w:r>
               <w:rPr>
                 <w:rFonts w:ascii="Times New Roman" w:hAnsi="Times New Roman"/>
-                <w:sz w:val="14"/>
+                <w:sz w:val="16"/>
               </w:rPr>
               <w:t>80.75</w:t>
             </w:r>
@@ -2286,7 +2286,7 @@
             <w:r>
               <w:rPr>
                 <w:rFonts w:ascii="Times New Roman" w:hAnsi="Times New Roman"/>
-                <w:sz w:val="14"/>
+                <w:sz w:val="16"/>
               </w:rPr>
               <w:t>80.23</w:t>
             </w:r>
@@ -2304,7 +2304,7 @@
             <w:r>
               <w:rPr>
                 <w:rFonts w:ascii="Times New Roman" w:hAnsi="Times New Roman"/>
-                <w:sz w:val="14"/>
+                <w:sz w:val="16"/>
               </w:rPr>
               <w:t>92.52</w:t>
             </w:r>
@@ -2326,7 +2326,7 @@
             <w:r>
               <w:rPr>
                 <w:rFonts w:ascii="Times New Roman" w:hAnsi="Times New Roman"/>
-                <w:sz w:val="14"/>
+                <w:sz w:val="16"/>
               </w:rPr>
               <w:t>XGBoost+LDA</w:t>
             </w:r>
@@ -2343,7 +2343,7 @@
             <w:r>
               <w:rPr>
                 <w:rFonts w:ascii="Times New Roman" w:hAnsi="Times New Roman"/>
-                <w:sz w:val="14"/>
+                <w:sz w:val="16"/>
               </w:rPr>
               <w:t>91.31</w:t>
             </w:r>
@@ -2360,7 +2360,7 @@
             <w:r>
               <w:rPr>
                 <w:rFonts w:ascii="Times New Roman" w:hAnsi="Times New Roman"/>
-                <w:sz w:val="14"/>
+                <w:sz w:val="16"/>
               </w:rPr>
               <w:t>78.89</w:t>
             </w:r>
@@ -2377,7 +2377,7 @@
             <w:r>
               <w:rPr>
                 <w:rFonts w:ascii="Times New Roman" w:hAnsi="Times New Roman"/>
-                <w:sz w:val="14"/>
+                <w:sz w:val="16"/>
               </w:rPr>
               <w:t>76.74</w:t>
             </w:r>
@@ -2394,7 +2394,7 @@
             <w:r>
               <w:rPr>
                 <w:rFonts w:ascii="Times New Roman" w:hAnsi="Times New Roman"/>
-                <w:sz w:val="14"/>
+                <w:sz w:val="16"/>
               </w:rPr>
               <w:t>91.59</w:t>
             </w:r>
@@ -2464,7 +2464,7 @@
             <w:r>
               <w:rPr>
                 <w:rFonts w:ascii="Times New Roman" w:hAnsi="Times New Roman"/>
-                <w:sz w:val="14"/>
+                <w:sz w:val="16"/>
               </w:rPr>
               <w:t>Class</w:t>
             </w:r>
@@ -2482,7 +2482,7 @@
             <w:r>
               <w:rPr>
                 <w:rFonts w:ascii="Times New Roman" w:hAnsi="Times New Roman"/>
-                <w:sz w:val="14"/>
+                <w:sz w:val="16"/>
               </w:rPr>
               <w:t>Precision</w:t>
             </w:r>
@@ -2500,7 +2500,7 @@
             <w:r>
               <w:rPr>
                 <w:rFonts w:ascii="Times New Roman" w:hAnsi="Times New Roman"/>
-                <w:sz w:val="14"/>
+                <w:sz w:val="16"/>
               </w:rPr>
               <w:t>Recall</w:t>
             </w:r>
@@ -2518,7 +2518,7 @@
             <w:r>
               <w:rPr>
                 <w:rFonts w:ascii="Times New Roman" w:hAnsi="Times New Roman"/>
-                <w:sz w:val="14"/>
+                <w:sz w:val="16"/>
               </w:rPr>
               <w:t>F1</w:t>
             </w:r>
@@ -2536,7 +2536,7 @@
             <w:r>
               <w:rPr>
                 <w:rFonts w:ascii="Times New Roman" w:hAnsi="Times New Roman"/>
-                <w:sz w:val="14"/>
+                <w:sz w:val="16"/>
               </w:rPr>
               <w:t>Support</w:t>
             </w:r>
@@ -2559,7 +2559,7 @@
             <w:r>
               <w:rPr>
                 <w:rFonts w:ascii="Times New Roman" w:hAnsi="Times New Roman"/>
-                <w:sz w:val="14"/>
+                <w:sz w:val="16"/>
               </w:rPr>
               <w:t>akiec</w:t>
             </w:r>
@@ -2577,7 +2577,7 @@
             <w:r>
               <w:rPr>
                 <w:rFonts w:ascii="Times New Roman" w:hAnsi="Times New Roman"/>
-                <w:sz w:val="14"/>
+                <w:sz w:val="16"/>
               </w:rPr>
               <w:t>0.6410</w:t>
             </w:r>
@@ -2595,7 +2595,7 @@
             <w:r>
               <w:rPr>
                 <w:rFonts w:ascii="Times New Roman" w:hAnsi="Times New Roman"/>
-                <w:sz w:val="14"/>
+                <w:sz w:val="16"/>
               </w:rPr>
               <w:t>0.5814</w:t>
             </w:r>
@@ -2613,7 +2613,7 @@
             <w:r>
               <w:rPr>
                 <w:rFonts w:ascii="Times New Roman" w:hAnsi="Times New Roman"/>
-                <w:sz w:val="14"/>
+                <w:sz w:val="16"/>
               </w:rPr>
               <w:t>0.6098</w:t>
             </w:r>
@@ -2631,7 +2631,7 @@
             <w:r>
               <w:rPr>
                 <w:rFonts w:ascii="Times New Roman" w:hAnsi="Times New Roman"/>
-                <w:sz w:val="14"/>
+                <w:sz w:val="16"/>
               </w:rPr>
               <w:t>43</w:t>
             </w:r>
@@ -2654,7 +2654,7 @@
             <w:r>
               <w:rPr>
                 <w:rFonts w:ascii="Times New Roman" w:hAnsi="Times New Roman"/>
-                <w:sz w:val="14"/>
+                <w:sz w:val="16"/>
               </w:rPr>
               <w:t>bcc</w:t>
             </w:r>
@@ -2672,7 +2672,7 @@
             <w:r>
               <w:rPr>
                 <w:rFonts w:ascii="Times New Roman" w:hAnsi="Times New Roman"/>
-                <w:sz w:val="14"/>
+                <w:sz w:val="16"/>
               </w:rPr>
               <w:t>0.7143</w:t>
             </w:r>
@@ -2690,7 +2690,7 @@
             <w:r>
               <w:rPr>
                 <w:rFonts w:ascii="Times New Roman" w:hAnsi="Times New Roman"/>
-                <w:sz w:val="14"/>
+                <w:sz w:val="16"/>
               </w:rPr>
               <w:t>0.8065</w:t>
             </w:r>
@@ -2708,7 +2708,7 @@
             <w:r>
               <w:rPr>
                 <w:rFonts w:ascii="Times New Roman" w:hAnsi="Times New Roman"/>
-                <w:sz w:val="14"/>
+                <w:sz w:val="16"/>
               </w:rPr>
               <w:t>0.7576</w:t>
             </w:r>
@@ -2726,7 +2726,7 @@
             <w:r>
               <w:rPr>
                 <w:rFonts w:ascii="Times New Roman" w:hAnsi="Times New Roman"/>
-                <w:sz w:val="14"/>
+                <w:sz w:val="16"/>
               </w:rPr>
               <w:t>93</w:t>
             </w:r>
@@ -2749,7 +2749,7 @@
             <w:r>
               <w:rPr>
                 <w:rFonts w:ascii="Times New Roman" w:hAnsi="Times New Roman"/>
-                <w:sz w:val="14"/>
+                <w:sz w:val="16"/>
               </w:rPr>
               <w:t>bkl</w:t>
             </w:r>
@@ -2767,7 +2767,7 @@
             <w:r>
               <w:rPr>
                 <w:rFonts w:ascii="Times New Roman" w:hAnsi="Times New Roman"/>
-                <w:sz w:val="14"/>
+                <w:sz w:val="16"/>
               </w:rPr>
               <w:t>0.7561</w:t>
             </w:r>
@@ -2785,7 +2785,7 @@
             <w:r>
               <w:rPr>
                 <w:rFonts w:ascii="Times New Roman" w:hAnsi="Times New Roman"/>
-                <w:sz w:val="14"/>
+                <w:sz w:val="16"/>
               </w:rPr>
               <w:t>0.7143</w:t>
             </w:r>
@@ -2803,7 +2803,7 @@
             <w:r>
               <w:rPr>
                 <w:rFonts w:ascii="Times New Roman" w:hAnsi="Times New Roman"/>
-                <w:sz w:val="14"/>
+                <w:sz w:val="16"/>
               </w:rPr>
               <w:t>0.7346</w:t>
             </w:r>
@@ -2821,7 +2821,7 @@
             <w:r>
               <w:rPr>
                 <w:rFonts w:ascii="Times New Roman" w:hAnsi="Times New Roman"/>
-                <w:sz w:val="14"/>
+                <w:sz w:val="16"/>
               </w:rPr>
               <w:t>217</w:t>
             </w:r>
@@ -2844,7 +2844,7 @@
             <w:r>
               <w:rPr>
                 <w:rFonts w:ascii="Times New Roman" w:hAnsi="Times New Roman"/>
-                <w:sz w:val="14"/>
+                <w:sz w:val="16"/>
               </w:rPr>
               <w:t>df</w:t>
             </w:r>
@@ -2862,7 +2862,7 @@
             <w:r>
               <w:rPr>
                 <w:rFonts w:ascii="Times New Roman" w:hAnsi="Times New Roman"/>
-                <w:sz w:val="14"/>
+                <w:sz w:val="16"/>
               </w:rPr>
               <w:t>0.7727</w:t>
             </w:r>
@@ -2880,7 +2880,7 @@
             <w:r>
               <w:rPr>
                 <w:rFonts w:ascii="Times New Roman" w:hAnsi="Times New Roman"/>
-                <w:sz w:val="14"/>
+                <w:sz w:val="16"/>
               </w:rPr>
               <w:t>0.7727</w:t>
             </w:r>
@@ -2898,7 +2898,7 @@
             <w:r>
               <w:rPr>
                 <w:rFonts w:ascii="Times New Roman" w:hAnsi="Times New Roman"/>
-                <w:sz w:val="14"/>
+                <w:sz w:val="16"/>
               </w:rPr>
               <w:t>0.7727</w:t>
             </w:r>
@@ -2916,7 +2916,7 @@
             <w:r>
               <w:rPr>
                 <w:rFonts w:ascii="Times New Roman" w:hAnsi="Times New Roman"/>
-                <w:sz w:val="14"/>
+                <w:sz w:val="16"/>
               </w:rPr>
               <w:t>44</w:t>
             </w:r>
@@ -2939,7 +2939,7 @@
             <w:r>
               <w:rPr>
                 <w:rFonts w:ascii="Times New Roman" w:hAnsi="Times New Roman"/>
-                <w:sz w:val="14"/>
+                <w:sz w:val="16"/>
               </w:rPr>
               <w:t>mel</w:t>
             </w:r>
@@ -2957,7 +2957,7 @@
             <w:r>
               <w:rPr>
                 <w:rFonts w:ascii="Times New Roman" w:hAnsi="Times New Roman"/>
-                <w:sz w:val="14"/>
+                <w:sz w:val="16"/>
               </w:rPr>
               <w:t>0.6277</w:t>
             </w:r>
@@ -2975,7 +2975,7 @@
             <w:r>
               <w:rPr>
                 <w:rFonts w:ascii="Times New Roman" w:hAnsi="Times New Roman"/>
-                <w:sz w:val="14"/>
+                <w:sz w:val="16"/>
               </w:rPr>
               <w:t>0.6901</w:t>
             </w:r>
@@ -2993,7 +2993,7 @@
             <w:r>
               <w:rPr>
                 <w:rFonts w:ascii="Times New Roman" w:hAnsi="Times New Roman"/>
-                <w:sz w:val="14"/>
+                <w:sz w:val="16"/>
               </w:rPr>
               <w:t>0.6574</w:t>
             </w:r>
@@ -3011,7 +3011,7 @@
             <w:r>
               <w:rPr>
                 <w:rFonts w:ascii="Times New Roman" w:hAnsi="Times New Roman"/>
-                <w:sz w:val="14"/>
+                <w:sz w:val="16"/>
               </w:rPr>
               <w:t>171</w:t>
             </w:r>
@@ -3034,7 +3034,7 @@
             <w:r>
               <w:rPr>
                 <w:rFonts w:ascii="Times New Roman" w:hAnsi="Times New Roman"/>
-                <w:sz w:val="14"/>
+                <w:sz w:val="16"/>
               </w:rPr>
               <w:t>nv</w:t>
             </w:r>
@@ -3052,7 +3052,7 @@
             <w:r>
               <w:rPr>
                 <w:rFonts w:ascii="Times New Roman" w:hAnsi="Times New Roman"/>
-                <w:sz w:val="14"/>
+                <w:sz w:val="16"/>
               </w:rPr>
               <w:t>0.9149</w:t>
             </w:r>
@@ -3070,7 +3070,7 @@
             <w:r>
               <w:rPr>
                 <w:rFonts w:ascii="Times New Roman" w:hAnsi="Times New Roman"/>
-                <w:sz w:val="14"/>
+                <w:sz w:val="16"/>
               </w:rPr>
               <w:t>0.9109</w:t>
             </w:r>
@@ -3088,7 +3088,7 @@
             <w:r>
               <w:rPr>
                 <w:rFonts w:ascii="Times New Roman" w:hAnsi="Times New Roman"/>
-                <w:sz w:val="14"/>
+                <w:sz w:val="16"/>
               </w:rPr>
               <w:t>0.9129</w:t>
             </w:r>
@@ -3106,7 +3106,7 @@
             <w:r>
               <w:rPr>
                 <w:rFonts w:ascii="Times New Roman" w:hAnsi="Times New Roman"/>
-                <w:sz w:val="14"/>
+                <w:sz w:val="16"/>
               </w:rPr>
               <w:t>909</w:t>
             </w:r>
@@ -3128,7 +3128,7 @@
             <w:r>
               <w:rPr>
                 <w:rFonts w:ascii="Times New Roman" w:hAnsi="Times New Roman"/>
-                <w:sz w:val="14"/>
+                <w:sz w:val="16"/>
               </w:rPr>
               <w:t>vasc</w:t>
             </w:r>
@@ -3145,7 +3145,7 @@
             <w:r>
               <w:rPr>
                 <w:rFonts w:ascii="Times New Roman" w:hAnsi="Times New Roman"/>
-                <w:sz w:val="14"/>
+                <w:sz w:val="16"/>
               </w:rPr>
               <w:t>0.8462</w:t>
             </w:r>
@@ -3162,7 +3162,7 @@
             <w:r>
               <w:rPr>
                 <w:rFonts w:ascii="Times New Roman" w:hAnsi="Times New Roman"/>
-                <w:sz w:val="14"/>
+                <w:sz w:val="16"/>
               </w:rPr>
               <w:t>0.6286</w:t>
             </w:r>
@@ -3179,7 +3179,7 @@
             <w:r>
               <w:rPr>
                 <w:rFonts w:ascii="Times New Roman" w:hAnsi="Times New Roman"/>
-                <w:sz w:val="14"/>
+                <w:sz w:val="16"/>
               </w:rPr>
               <w:t>0.7213</w:t>
             </w:r>
@@ -3196,7 +3196,7 @@
             <w:r>
               <w:rPr>
                 <w:rFonts w:ascii="Times New Roman" w:hAnsi="Times New Roman"/>
-                <w:sz w:val="14"/>
+                <w:sz w:val="16"/>
               </w:rPr>
               <w:t>35</w:t>
             </w:r>
@@ -3306,7 +3306,7 @@
             <w:r>
               <w:rPr>
                 <w:rFonts w:ascii="Times New Roman" w:hAnsi="Times New Roman"/>
-                <w:sz w:val="14"/>
+                <w:sz w:val="16"/>
               </w:rPr>
               <w:t>Large head</w:t>
             </w:r>
@@ -3324,7 +3324,7 @@
             <w:r>
               <w:rPr>
                 <w:rFonts w:ascii="Times New Roman" w:hAnsi="Times New Roman"/>
-                <w:sz w:val="14"/>
+                <w:sz w:val="16"/>
               </w:rPr>
               <w:t>HAM acc.</w:t>
             </w:r>
@@ -3342,7 +3342,7 @@
             <w:r>
               <w:rPr>
                 <w:rFonts w:ascii="Times New Roman" w:hAnsi="Times New Roman"/>
-                <w:sz w:val="14"/>
+                <w:sz w:val="16"/>
               </w:rPr>
               <w:t>HAM F1</w:t>
             </w:r>
@@ -3360,7 +3360,7 @@
             <w:r>
               <w:rPr>
                 <w:rFonts w:ascii="Times New Roman" w:hAnsi="Times New Roman"/>
-                <w:sz w:val="14"/>
+                <w:sz w:val="16"/>
               </w:rPr>
               <w:t>ISIC acc.</w:t>
             </w:r>
@@ -3378,7 +3378,7 @@
             <w:r>
               <w:rPr>
                 <w:rFonts w:ascii="Times New Roman" w:hAnsi="Times New Roman"/>
-                <w:sz w:val="14"/>
+                <w:sz w:val="16"/>
               </w:rPr>
               <w:t>ISIC F1</w:t>
             </w:r>
@@ -3401,7 +3401,7 @@
             <w:r>
               <w:rPr>
                 <w:rFonts w:ascii="Times New Roman" w:hAnsi="Times New Roman"/>
-                <w:sz w:val="14"/>
+                <w:sz w:val="16"/>
               </w:rPr>
               <w:t>192–64 MLP</w:t>
             </w:r>
@@ -3419,7 +3419,7 @@
             <w:r>
               <w:rPr>
                 <w:rFonts w:ascii="Times New Roman" w:hAnsi="Times New Roman"/>
-                <w:sz w:val="14"/>
+                <w:sz w:val="16"/>
               </w:rPr>
               <w:t>93.99</w:t>
             </w:r>
@@ -3437,7 +3437,7 @@
             <w:r>
               <w:rPr>
                 <w:rFonts w:ascii="Times New Roman" w:hAnsi="Times New Roman"/>
-                <w:sz w:val="14"/>
+                <w:sz w:val="16"/>
               </w:rPr>
               <w:t>87.38</w:t>
             </w:r>
@@ -3455,7 +3455,7 @@
             <w:r>
               <w:rPr>
                 <w:rFonts w:ascii="Times New Roman" w:hAnsi="Times New Roman"/>
-                <w:sz w:val="14"/>
+                <w:sz w:val="16"/>
               </w:rPr>
               <w:t>85.91</w:t>
             </w:r>
@@ -3473,7 +3473,7 @@
             <w:r>
               <w:rPr>
                 <w:rFonts w:ascii="Times New Roman" w:hAnsi="Times New Roman"/>
-                <w:sz w:val="14"/>
+                <w:sz w:val="16"/>
               </w:rPr>
               <w:t>79.02</w:t>
             </w:r>
@@ -3496,7 +3496,7 @@
             <w:r>
               <w:rPr>
                 <w:rFonts w:ascii="Times New Roman" w:hAnsi="Times New Roman"/>
-                <w:sz w:val="14"/>
+                <w:sz w:val="16"/>
               </w:rPr>
               <w:t>128 MLP</w:t>
             </w:r>
@@ -3514,7 +3514,7 @@
             <w:r>
               <w:rPr>
                 <w:rFonts w:ascii="Times New Roman" w:hAnsi="Times New Roman"/>
-                <w:sz w:val="14"/>
+                <w:sz w:val="16"/>
               </w:rPr>
               <w:t>93.26</w:t>
             </w:r>
@@ -3532,7 +3532,7 @@
             <w:r>
               <w:rPr>
                 <w:rFonts w:ascii="Times New Roman" w:hAnsi="Times New Roman"/>
-                <w:sz w:val="14"/>
+                <w:sz w:val="16"/>
               </w:rPr>
               <w:t>85.75</w:t>
             </w:r>
@@ -3550,7 +3550,7 @@
             <w:r>
               <w:rPr>
                 <w:rFonts w:ascii="Times New Roman" w:hAnsi="Times New Roman"/>
-                <w:sz w:val="14"/>
+                <w:sz w:val="16"/>
               </w:rPr>
               <w:t>85.71</w:t>
             </w:r>
@@ -3568,7 +3568,7 @@
             <w:r>
               <w:rPr>
                 <w:rFonts w:ascii="Times New Roman" w:hAnsi="Times New Roman"/>
-                <w:sz w:val="14"/>
+                <w:sz w:val="16"/>
               </w:rPr>
               <w:t>78.60</w:t>
             </w:r>
@@ -3591,7 +3591,7 @@
             <w:r>
               <w:rPr>
                 <w:rFonts w:ascii="Times New Roman" w:hAnsi="Times New Roman"/>
-                <w:sz w:val="14"/>
+                <w:sz w:val="16"/>
               </w:rPr>
               <w:t>Linear</w:t>
             </w:r>
@@ -3609,7 +3609,7 @@
             <w:r>
               <w:rPr>
                 <w:rFonts w:ascii="Times New Roman" w:hAnsi="Times New Roman"/>
-                <w:sz w:val="14"/>
+                <w:sz w:val="16"/>
               </w:rPr>
               <w:t>92.53</w:t>
             </w:r>
@@ -3627,7 +3627,7 @@
             <w:r>
               <w:rPr>
                 <w:rFonts w:ascii="Times New Roman" w:hAnsi="Times New Roman"/>
-                <w:sz w:val="14"/>
+                <w:sz w:val="16"/>
               </w:rPr>
               <w:t>81.74</w:t>
             </w:r>
@@ -3645,7 +3645,7 @@
             <w:r>
               <w:rPr>
                 <w:rFonts w:ascii="Times New Roman" w:hAnsi="Times New Roman"/>
-                <w:sz w:val="14"/>
+                <w:sz w:val="16"/>
               </w:rPr>
               <w:t>84.33</w:t>
             </w:r>
@@ -3663,7 +3663,7 @@
             <w:r>
               <w:rPr>
                 <w:rFonts w:ascii="Times New Roman" w:hAnsi="Times New Roman"/>
-                <w:sz w:val="14"/>
+                <w:sz w:val="16"/>
               </w:rPr>
               <w:t>76.19</w:t>
             </w:r>
@@ -3686,7 +3686,7 @@
             <w:r>
               <w:rPr>
                 <w:rFonts w:ascii="Times New Roman" w:hAnsi="Times New Roman"/>
-                <w:sz w:val="14"/>
+                <w:sz w:val="16"/>
               </w:rPr>
               <w:t>XGBoost+LDA</w:t>
             </w:r>
@@ -3704,7 +3704,7 @@
             <w:r>
               <w:rPr>
                 <w:rFonts w:ascii="Times New Roman" w:hAnsi="Times New Roman"/>
-                <w:sz w:val="14"/>
+                <w:sz w:val="16"/>
               </w:rPr>
               <w:t>91.48</w:t>
             </w:r>
@@ -3722,7 +3722,7 @@
             <w:r>
               <w:rPr>
                 <w:rFonts w:ascii="Times New Roman" w:hAnsi="Times New Roman"/>
-                <w:sz w:val="14"/>
+                <w:sz w:val="16"/>
               </w:rPr>
               <w:t>79.18</w:t>
             </w:r>
@@ -3740,7 +3740,7 @@
             <w:r>
               <w:rPr>
                 <w:rFonts w:ascii="Times New Roman" w:hAnsi="Times New Roman"/>
-                <w:sz w:val="14"/>
+                <w:sz w:val="16"/>
               </w:rPr>
               <w:t>82.21</w:t>
             </w:r>
@@ -3758,7 +3758,7 @@
             <w:r>
               <w:rPr>
                 <w:rFonts w:ascii="Times New Roman" w:hAnsi="Times New Roman"/>
-                <w:sz w:val="14"/>
+                <w:sz w:val="16"/>
               </w:rPr>
               <w:t>73.08</w:t>
             </w:r>
@@ -3780,7 +3780,7 @@
             <w:r>
               <w:rPr>
                 <w:rFonts w:ascii="Times New Roman" w:hAnsi="Times New Roman"/>
-                <w:sz w:val="14"/>
+                <w:sz w:val="16"/>
               </w:rPr>
               <w:t>Author probe*</w:t>
             </w:r>
@@ -3797,7 +3797,7 @@
             <w:r>
               <w:rPr>
                 <w:rFonts w:ascii="Times New Roman" w:hAnsi="Times New Roman"/>
-                <w:sz w:val="14"/>
+                <w:sz w:val="16"/>
               </w:rPr>
               <w:t>92.37</w:t>
             </w:r>
@@ -3814,7 +3814,7 @@
             <w:r>
               <w:rPr>
                 <w:rFonts w:ascii="Times New Roman" w:hAnsi="Times New Roman"/>
-                <w:sz w:val="14"/>
+                <w:sz w:val="16"/>
               </w:rPr>
               <w:t>80.98</w:t>
             </w:r>
@@ -3831,7 +3831,7 @@
             <w:r>
               <w:rPr>
                 <w:rFonts w:ascii="Times New Roman" w:hAnsi="Times New Roman"/>
-                <w:sz w:val="14"/>
+                <w:sz w:val="16"/>
               </w:rPr>
               <w:t>82.94</w:t>
             </w:r>
@@ -3848,7 +3848,7 @@
             <w:r>
               <w:rPr>
                 <w:rFonts w:ascii="Times New Roman" w:hAnsi="Times New Roman"/>
-                <w:sz w:val="14"/>
+                <w:sz w:val="16"/>
               </w:rPr>
               <w:t>71.58</w:t>
             </w:r>
@@ -3965,7 +3965,7 @@
         <w:jc w:val="both"/>
       </w:pPr>
       <w:r>
-        <w:t>The principal evidence is stored with the project: outputs/feature_models/efficientnet_b0_improved/REPORT.md; outputs/feature_models/panderm_base_comparison/REPORT.md; outputs/feature_models/panderm_large_comparison/REPORT.md; outputs/feature_models/panderm_large_refined/REPORT.md; outputs/feature_models/panderm_large_capacity/REPORT.md; and outputs/diagnostics/joint_refinement/REPORT.md. These folders include split manifests, configuration and selection metadata, saved predictions, per-class statistics, and verification receipts. The federated smoke receipt is artifacts/federated-demo/models_dir/federated_metrics.json.</w:t>
+        <w:t>Experiment reports and receipts are stored in the project’s feature-model output folders for improved EfficientNet, PanDerm Base, PanDerm Large, refined heads and the capacity search. The joint-refinement diagnostics folder records the adapted-head protocol and selection receipts. These folders include split manifests, configuration and selection metadata, saved predictions, per-class statistics, and verification receipts. The federated-demo artifacts contain the synthetic run’s metrics.</w:t>
       </w:r>
     </w:p>
     <w:p>
@@ -3989,7 +3989,7 @@
         <w:jc w:val="both"/>
       </w:pPr>
       <w:r>
-        <w:t>Prepared from repository source, experiment reports, metric receipts, and verification artifacts available October 28, 2026. Dataset discussion is limited to details needed to interpret evaluation protocols.</w:t>
+        <w:t>Prepared from repository source, experiment reports, metric receipts, and verification artifacts available October 28, 2026.</w:t>
       </w:r>
     </w:p>
     <w:p>

</xml_diff>